<commit_message>
docs+sample: 更正样例 docx 正文误导描述并同步 SERVER.MD/CLAUDE.MD
示例文档.docx 正文改掉「选中 .docx 只回桌面提示」的旧说法，改述为服务端解析
/ 上传本机 / 复杂结构降级；重生 docx。

SERVER.MD：docx_preview/commit 改述为服务端同步解析（adm-zip/fast-xml-parser）、
降级 warnings、保真度低于桌面引擎；新增「沙盒会话销毁（心跳 + 短 TTL 清扫）」一节。
CLAUDE.MD：分流清单把 docx_preview/commit 从桌面专属移到服务端已镜像，export_docx
仍桌面专属；补会话销毁与上传入口说明。
</commit_message>
<xml_diff>
--- a/server/default-vault/示例文档.docx
+++ b/server/default-vault/示例文档.docx
@@ -12,7 +12,7 @@
     </w:p>
     <w:p>
       <w:r>
-        <w:t xml:space="preserve">这是一份用于演示「导入 Word」入口的样例文档。桌面版打开后选「更多 → 导入 Word」，选中本文件即可看到它被转成 Markdown；网页沙盒里这一步会提示「请下载桌面版」，因为文档解析与落库属于桌面专属能力。</w:t>
+        <w:t xml:space="preserve">这是一份演示「导入 Word」入口的样例文档。工具条「更多 → 导入 Word」选中本文件，网页沙盒会把它交给服务端解析成 Markdown，在右侧校对弹窗里可继续编辑，接受后即落进你自己的临时工作区并打开——关掉浏览器这份会话连同改动一起销毁。</w:t>
       </w:r>
     </w:p>
     <w:p>
@@ -43,12 +43,12 @@
         <w:t>斜体</w:t>
       </w:r>
       <w:r>
-        <w:t xml:space="preserve">，导入后会变成 **加粗** 和 *斜体*。</w:t>
+        <w:t xml:space="preserve">，导入后会变成 Markdown 的加粗与斜体。也可「上传本机文件」把自己电脑上的 .docx 传进来试。</w:t>
       </w:r>
     </w:p>
     <w:p>
       <w:r>
-        <w:t>最后一段：一个待办 - [ ] 记得试试桌面版的完整导入与校对流程。</w:t>
+        <w:t xml:space="preserve">网页沙盒用的是轻量解析，公式、交叉引用等复杂结构会在校对弹窗里标注为已降级；要完整保真的导入请下载桌面版。</w:t>
       </w:r>
     </w:p>
     <w:sectPr>

</xml_diff>